<commit_message>
P43: Borang 4 Fakta + Sasaran (01, 02 PDF, 04)
</commit_message>
<xml_diff>
--- a/01_Garis_Panduan_CDKK.docx
+++ b/01_Garis_Panduan_CDKK.docx
@@ -194,16 +194,6 @@
                 <w:lang w:val="ms-MY"/>
               </w:rPr>
               <w:t xml:space="preserve">Pertandingan Cabaran Digital Kreatif Komuniti (CDKK) </w:t>
-            </w:r>
-            <w:r>
-              <w:rPr>
-                <w:b/>
-                <w:bCs/>
-                <w:color w:val="1F4E79"/>
-                <w:sz w:val="30"/>
-                <w:szCs w:val="30"/>
-                <w:lang w:val="ms-MY"/>
-              </w:rPr>
               <w:br/>
               <w:t>KEMAS @FESMA Tahun 2026</w:t>
             </w:r>
@@ -5510,11 +5500,6 @@
                 <w:lang w:val="ms-MY"/>
               </w:rPr>
               <w:t xml:space="preserve">Format Fail </w:t>
-            </w:r>
-            <w:r>
-              <w:rPr>
-                <w:lang w:val="ms-MY"/>
-              </w:rPr>
               <w:br/>
               <w:t>(File Compression)</w:t>
             </w:r>
@@ -5588,11 +5573,6 @@
                 <w:lang w:val="ms-MY"/>
               </w:rPr>
               <w:t xml:space="preserve">Nisbah Paparan </w:t>
-            </w:r>
-            <w:r>
-              <w:rPr>
-                <w:lang w:val="ms-MY"/>
-              </w:rPr>
               <w:br/>
               <w:t>(Aspect Ratio)</w:t>
             </w:r>
@@ -11099,7 +11079,7 @@
           <w:lang w:val="ms-MY"/>
         </w:rPr>
         <w:tab/>
-        <w:t>Data yang dimaksudkan dalam perenggan 10.10 ialah angka prestasi sedia ada dan unjuran bagi tempoh yang ditetapkan sendiri oleh kumpulan. Tetingkap data tidak ditetapkan oleh penganjur kerana subjek FESMA berbeza-beza umur perniagaan atau program dan tahap rekod. Sebagai contoh, kumpulan boleh merekodkan tiga (3) titik data sejarah dan tiga (3) titik unjuran, sama ada mengikut tahun, suku tahun atau bulan, mengikut apa yang tersedia; bilangan ini hanyalah contoh dan kumpulan boleh merekodkan lebih atau kurang daripada itu mengikut kesesuaian data yang ada. Tetingkap yang dipilih hendaklah dinyatakan dalam Borang 4. Kedua-dua set angka diperoleh menerusi temu bual dengan subjek atau pengesah berkenaan pada hari pertandingan.</w:t>
+        <w:t xml:space="preserve">Data yang dimaksudkan dalam perenggan 10.10 ialah angka prestasi sebenar bagi tempoh yang ditetapkan sendiri oleh kumpulan mengikut rekod yang ada pada subjek, berserta sasaran subjek bagi tempoh akan datang. Tempoh tidak ditetapkan oleh penganjur kerana subjek FESMA berbeza-beza umur perniagaan atau program dan tahap rekod. Sebagai contoh, kumpulan boleh merekodkan tiga (3) angka sebenar, sama ada mengikut hari, bulan atau tahun, dan satu (1) sasaran; bilangan ini hanyalah contoh dan kumpulan boleh merekodkan lebih daripada itu mengikut kesesuaian data yang ada. Kedua-dua set angka diperoleh menerusi temu bual dengan subjek atau pengesah berkenaan pada hari pertandingan.</w:t>
       </w:r>
     </w:p>
     <w:p>
@@ -11157,7 +11137,7 @@
           <w:lang w:val="ms-MY"/>
         </w:rPr>
         <w:tab/>
-        <w:t>Kaedah yang digunakan untuk menghasilkan unjuran hendaklah dinyatakan secara terbuka dalam Borang 4 dan digunakan secara konsisten dalam video. Unjuran ialah anggaran, justeru penilaian tertumpu kepada kemunasabahan kaedah bukan kepada ketepatan mutlak nombor masa depan.</w:t>
+        <w:t xml:space="preserve">Sasaran yang direkodkan hendaklah dinyatakan sumbernya dalam Borang 4, sama ada diberi sendiri oleh subjek atau dianggarkan oleh kumpulan menerusi kiraan mudah yang dinyatakan, dan digunakan secara konsisten dalam video. Sasaran ialah anggaran, justeru penilaian tertumpu kepada kemunasabahan sasaran dan kejelasan sumbernya, bukan kepada ketepatan mutlak nombor masa depan.</w:t>
       </w:r>
     </w:p>
     <w:tbl>
@@ -12765,7 +12745,7 @@
               <w:rPr>
                 <w:lang w:val="ms-MY"/>
               </w:rPr>
-              <w:t>Kejelasan mesej, ketepatan angka atau data subjek rakaman mengikut kategori pasukan yang disahkan oleh subjek pengesah, kemunasabahan kaedah unjuran atau sasaran, narrative structure dan impak kepada komuniti</w:t>
+              <w:t xml:space="preserve">Kejelasan mesej, ketepatan angka atau data subjek rakaman mengikut kategori pasukan yang disahkan oleh subjek pengesah, kemunasabahan sasaran, narrative structure dan impak kepada komuniti</w:t>
             </w:r>
           </w:p>
         </w:tc>

</xml_diff>

<commit_message>
Cover 01 dan 02 penuh muka surat (baris jadual cover exact)
</commit_message>
<xml_diff>
--- a/01_Garis_Panduan_CDKK.docx
+++ b/01_Garis_Panduan_CDKK.docx
@@ -30,7 +30,7 @@
       <w:tr>
         <w:trPr>
           <w:cantSplit/>
-          <w:trHeight w:val="12600"/>
+          <w:trHeight w:val="13700" w:hRule="exact"/>
         </w:trPr>
         <w:tc>
           <w:tcPr>
@@ -326,7 +326,7 @@
       <w:tr>
         <w:trPr>
           <w:cantSplit/>
-          <w:trHeight w:val="2219"/>
+          <w:trHeight w:val="2219" w:hRule="exact"/>
         </w:trPr>
         <w:tc>
           <w:tcPr>
@@ -558,6 +558,7 @@
       <w:tr>
         <w:trPr>
           <w:cantSplit/>
+          <w:trHeight w:val="899" w:hRule="exact"/>
         </w:trPr>
         <w:tc>
           <w:tcPr>
@@ -601,7 +602,8 @@
     </w:tbl>
     <w:p>
       <w:pPr>
-        <w:spacing w:line="20" w:lineRule="exact"/>
+        <w:shd w:val="clear" w:color="auto" w:fill="1F4E79"/>
+        <w:spacing w:before="0" w:after="0" w:line="20" w:lineRule="exact"/>
         <w:rPr>
           <w:sz w:val="2"/>
           <w:szCs w:val="2"/>

</xml_diff>

<commit_message>
P44: Canva b-roll minimum dua (2) visual (01, 02 PDF)
</commit_message>
<xml_diff>
--- a/01_Garis_Panduan_CDKK.docx
+++ b/01_Garis_Panduan_CDKK.docx
@@ -30,7 +30,7 @@
       <w:tr>
         <w:trPr>
           <w:cantSplit/>
-          <w:trHeight w:val="13700" w:hRule="exact"/>
+          <w:trHeight w:hRule="exact" w:val="13970"/>
         </w:trPr>
         <w:tc>
           <w:tcPr>
@@ -194,6 +194,16 @@
                 <w:lang w:val="ms-MY"/>
               </w:rPr>
               <w:t xml:space="preserve">Pertandingan Cabaran Digital Kreatif Komuniti (CDKK) </w:t>
+            </w:r>
+            <w:r>
+              <w:rPr>
+                <w:b/>
+                <w:bCs/>
+                <w:color w:val="1F4E79"/>
+                <w:sz w:val="30"/>
+                <w:szCs w:val="30"/>
+                <w:lang w:val="ms-MY"/>
+              </w:rPr>
               <w:br/>
               <w:t>KEMAS @FESMA Tahun 2026</w:t>
             </w:r>
@@ -326,7 +336,7 @@
       <w:tr>
         <w:trPr>
           <w:cantSplit/>
-          <w:trHeight w:val="2219" w:hRule="exact"/>
+          <w:trHeight w:hRule="exact" w:val="2219"/>
         </w:trPr>
         <w:tc>
           <w:tcPr>
@@ -481,7 +491,7 @@
         </w:tc>
         <w:tc>
           <w:tcPr>
-            <w:tcW w:w="3968" w:type="dxa"/>
+            <w:tcW w:w="3970" w:type="dxa"/>
             <w:tcBorders>
               <w:top w:val="none" w:sz="0" w:space="0" w:color="FFFFFF"/>
               <w:left w:val="single" w:sz="2" w:space="0" w:color="B8860B"/>
@@ -555,55 +565,11 @@
           </w:p>
         </w:tc>
       </w:tr>
-      <w:tr>
-        <w:trPr>
-          <w:cantSplit/>
-          <w:trHeight w:val="899" w:hRule="exact"/>
-        </w:trPr>
-        <w:tc>
-          <w:tcPr>
-            <w:tcW w:w="11906" w:type="dxa"/>
-            <w:gridSpan w:val="4"/>
-            <w:tcBorders>
-              <w:top w:val="none" w:sz="0" w:space="0" w:color="FFFFFF"/>
-              <w:left w:val="none" w:sz="0" w:space="0" w:color="FFFFFF"/>
-              <w:bottom w:val="none" w:sz="0" w:space="0" w:color="FFFFFF"/>
-              <w:right w:val="none" w:sz="0" w:space="0" w:color="FFFFFF"/>
-            </w:tcBorders>
-            <w:shd w:val="clear" w:color="auto" w:fill="1F4E79"/>
-            <w:tcMar>
-              <w:top w:w="150" w:type="dxa"/>
-              <w:left w:w="160" w:type="dxa"/>
-              <w:bottom w:w="150" w:type="dxa"/>
-              <w:right w:w="160" w:type="dxa"/>
-            </w:tcMar>
-          </w:tcPr>
-          <w:p>
-            <w:pPr>
-              <w:jc w:val="center"/>
-              <w:rPr>
-                <w:lang w:val="ms-MY"/>
-              </w:rPr>
-            </w:pPr>
-            <w:r>
-              <w:rPr>
-                <w:b/>
-                <w:bCs/>
-                <w:color w:val="FFFFFF"/>
-                <w:sz w:val="21"/>
-                <w:szCs w:val="21"/>
-                <w:lang w:val="ms-MY"/>
-              </w:rPr>
-              <w:t>DOKUMEN RASMI PERTANDINGAN</w:t>
-            </w:r>
-          </w:p>
-        </w:tc>
-      </w:tr>
     </w:tbl>
     <w:p>
       <w:pPr>
         <w:shd w:val="clear" w:color="auto" w:fill="1F4E79"/>
-        <w:spacing w:before="0" w:after="0" w:line="20" w:lineRule="exact"/>
+        <w:spacing w:line="20" w:lineRule="exact"/>
         <w:rPr>
           <w:sz w:val="2"/>
           <w:szCs w:val="2"/>
@@ -5502,6 +5468,11 @@
                 <w:lang w:val="ms-MY"/>
               </w:rPr>
               <w:t xml:space="preserve">Format Fail </w:t>
+            </w:r>
+            <w:r>
+              <w:rPr>
+                <w:lang w:val="ms-MY"/>
+              </w:rPr>
               <w:br/>
               <w:t>(File Compression)</w:t>
             </w:r>
@@ -5575,6 +5546,11 @@
                 <w:lang w:val="ms-MY"/>
               </w:rPr>
               <w:t xml:space="preserve">Nisbah Paparan </w:t>
+            </w:r>
+            <w:r>
+              <w:rPr>
+                <w:lang w:val="ms-MY"/>
+              </w:rPr>
               <w:br/>
               <w:t>(Aspect Ratio)</w:t>
             </w:r>
@@ -7827,7 +7803,7 @@
           <w:lang w:val="ms-MY"/>
         </w:rPr>
         <w:tab/>
-        <w:t>Canva hendaklah digunakan bagi menghasilkan video cover, poster, infografik, diagram, chart, visual layout, icon, text, visual slide, skrin end credit dan graphic asset utama. Tiga kegunaan berikut adalah WAJIB bagi setiap pasukan: pertama, cover atau muka hadapan video; kedua, sebarang infografik, diagram, graf atau visual yang muncul sebagai b-roll dalam video; dan ketiga, skrin end credit, sekurang-kurangnya sebagai latar bagi teks kredit dan elemen penutup. Bilangan keseluruhan aset visual tidak ditetapkan dan dinilai di bawah komponen Penggunaan Canva.</w:t>
+        <w:t xml:space="preserve">Canva hendaklah digunakan bagi menghasilkan video cover, poster, infografik, diagram, chart, visual layout, icon, text, visual slide, skrin end credit dan graphic asset utama. Tiga kegunaan berikut adalah WAJIB bagi setiap pasukan: pertama, cover atau muka hadapan video; kedua, sekurang-kurangnya dua (2) visual Canva berupa infografik, diagram, graf atau lain-lain yang muncul sebagai b-roll dalam video; dan ketiga, skrin end credit, sekurang-kurangnya sebagai latar bagi teks kredit dan elemen penutup. Bilangan keseluruhan aset visual tidak ditetapkan dan dinilai di bawah komponen Penggunaan Canva.</w:t>
       </w:r>
     </w:p>
     <w:p>
@@ -11081,7 +11057,7 @@
           <w:lang w:val="ms-MY"/>
         </w:rPr>
         <w:tab/>
-        <w:t xml:space="preserve">Data yang dimaksudkan dalam perenggan 10.10 ialah angka prestasi sebenar bagi tempoh yang ditetapkan sendiri oleh kumpulan mengikut rekod yang ada pada subjek, berserta sasaran subjek bagi tempoh akan datang. Tempoh tidak ditetapkan oleh penganjur kerana subjek FESMA berbeza-beza umur perniagaan atau program dan tahap rekod. Sebagai contoh, kumpulan boleh merekodkan tiga (3) angka sebenar, sama ada mengikut hari, bulan atau tahun, dan satu (1) sasaran; bilangan ini hanyalah contoh dan kumpulan boleh merekodkan lebih daripada itu mengikut kesesuaian data yang ada. Kedua-dua set angka diperoleh menerusi temu bual dengan subjek atau pengesah berkenaan pada hari pertandingan.</w:t>
+        <w:t>Data yang dimaksudkan dalam perenggan 10.10 ialah angka prestasi sebenar bagi tempoh yang ditetapkan sendiri oleh kumpulan mengikut rekod yang ada pada subjek, berserta sasaran subjek bagi tempoh akan datang. Tempoh tidak ditetapkan oleh penganjur kerana subjek FESMA berbeza-beza umur perniagaan atau program dan tahap rekod. Sebagai contoh, kumpulan boleh merekodkan tiga (3) angka sebenar, sama ada mengikut hari, bulan atau tahun, dan satu (1) sasaran; bilangan ini hanyalah contoh dan kumpulan boleh merekodkan lebih daripada itu mengikut kesesuaian data yang ada. Kedua-dua set angka diperoleh menerusi temu bual dengan subjek atau pengesah berkenaan pada hari pertandingan.</w:t>
       </w:r>
     </w:p>
     <w:p>
@@ -11139,7 +11115,7 @@
           <w:lang w:val="ms-MY"/>
         </w:rPr>
         <w:tab/>
-        <w:t xml:space="preserve">Sasaran yang direkodkan hendaklah dinyatakan sumbernya dalam Borang 4, sama ada diberi sendiri oleh subjek atau dianggarkan oleh kumpulan menerusi kiraan mudah yang dinyatakan, dan digunakan secara konsisten dalam video. Sasaran ialah anggaran, justeru penilaian tertumpu kepada kemunasabahan sasaran dan kejelasan sumbernya, bukan kepada ketepatan mutlak nombor masa depan.</w:t>
+        <w:t>Sasaran yang direkodkan hendaklah dinyatakan sumbernya dalam Borang 4, sama ada diberi sendiri oleh subjek atau dianggarkan oleh kumpulan menerusi kiraan mudah yang dinyatakan, dan digunakan secara konsisten dalam video. Sasaran ialah anggaran, justeru penilaian tertumpu kepada kemunasabahan sasaran dan kejelasan sumbernya, bukan kepada ketepatan mutlak nombor masa depan.</w:t>
       </w:r>
     </w:p>
     <w:tbl>
@@ -11202,6 +11178,7 @@
                 <w:szCs w:val="16"/>
                 <w:lang w:val="ms-MY"/>
               </w:rPr>
+              <w:lastRenderedPageBreak/>
               <w:t xml:space="preserve">RUJUKAN  </w:t>
             </w:r>
             <w:r>
@@ -11241,7 +11218,6 @@
         <w:rPr>
           <w:lang w:val="ms-MY"/>
         </w:rPr>
-        <w:lastRenderedPageBreak/>
         <w:br w:type="page"/>
       </w:r>
     </w:p>
@@ -12747,7 +12723,7 @@
               <w:rPr>
                 <w:lang w:val="ms-MY"/>
               </w:rPr>
-              <w:t xml:space="preserve">Kejelasan mesej, ketepatan angka atau data subjek rakaman mengikut kategori pasukan yang disahkan oleh subjek pengesah, kemunasabahan sasaran, narrative structure dan impak kepada komuniti</w:t>
+              <w:t>Kejelasan mesej, ketepatan angka atau data subjek rakaman mengikut kategori pasukan yang disahkan oleh subjek pengesah, kemunasabahan sasaran, narrative structure dan impak kepada komuniti</w:t>
             </w:r>
           </w:p>
         </w:tc>
@@ -19670,7 +19646,25 @@
         <w:sz w:val="11"/>
         <w:szCs w:val="11"/>
       </w:rPr>
-      <w:t xml:space="preserve"> daripada </w:t>
+      <w:t xml:space="preserve"> </w:t>
+    </w:r>
+    <w:proofErr w:type="spellStart"/>
+    <w:r>
+      <w:rPr>
+        <w:color w:val="6B7280"/>
+        <w:sz w:val="11"/>
+        <w:szCs w:val="11"/>
+      </w:rPr>
+      <w:t>daripada</w:t>
+    </w:r>
+    <w:proofErr w:type="spellEnd"/>
+    <w:r>
+      <w:rPr>
+        <w:color w:val="6B7280"/>
+        <w:sz w:val="11"/>
+        <w:szCs w:val="11"/>
+      </w:rPr>
+      <w:t xml:space="preserve"> </w:t>
     </w:r>
     <w:r>
       <w:rPr>

</xml_diff>